<commit_message>
docs: finalize live defect issue sync
</commit_message>
<xml_diff>
--- a/Report Test subject/Powered by GPT/MainReport/Powered by GPT - Software Quality Verification - Final Report.docx
+++ b/Report Test subject/Powered by GPT/MainReport/Powered by GPT - Software Quality Verification - Final Report.docx
@@ -7032,51 +7032,57 @@
         <w:rPr>
           <w:rFonts w:ascii="Courier New" w:hAnsi="Courier New" w:cs="Courier New"/>
         </w:rPr>
-        <w:t>The main limitation of the current package is no longer execution depth. All `63` designed test cases now have real runtime evidence. The remaining limitation is unresolved defect count: the system still contains four confirmed defects across invoices, purchases, and product import, including one GitHub-tracked invoice-create defect with server-log proof. Because of this, the report still cannot responsibly claim that the full system is stable.</w:t>
-      </w:r>
-    </w:p>
-    <w:p>
-      <w:pPr>
-        <w:pStyle w:val="PlainText"/>
-        <w:rPr>
-          <w:rFonts w:ascii="Courier New" w:hAnsi="Courier New" w:cs="Courier New"/>
-        </w:rPr>
-      </w:pPr>
-    </w:p>
-    <w:p>
-      <w:pPr>
-        <w:pStyle w:val="PlainText"/>
-        <w:rPr>
-          <w:rFonts w:ascii="Courier New" w:hAnsi="Courier New" w:cs="Courier New"/>
-        </w:rPr>
-      </w:pPr>
-      <w:r>
-        <w:rPr>
-          <w:rFonts w:ascii="Courier New" w:hAnsi="Courier New" w:cs="Courier New"/>
-        </w:rPr>
-        <w:t>The package also still lacks two bug-management completions that would improve its final polish:</w:t>
-      </w:r>
-    </w:p>
-    <w:p>
-      <w:pPr>
-        <w:pStyle w:val="PlainText"/>
-        <w:rPr>
-          <w:rFonts w:ascii="Courier New" w:hAnsi="Courier New" w:cs="Courier New"/>
-        </w:rPr>
-      </w:pPr>
-    </w:p>
-    <w:p>
-      <w:pPr>
-        <w:pStyle w:val="PlainText"/>
-        <w:rPr>
-          <w:rFonts w:ascii="Courier New" w:hAnsi="Courier New" w:cs="Courier New"/>
-        </w:rPr>
-      </w:pPr>
-      <w:r>
-        <w:rPr>
-          <w:rFonts w:ascii="Courier New" w:hAnsi="Courier New" w:cs="Courier New"/>
-        </w:rPr>
-        <w:t>- GitHub issues have not yet been opened for `BUG-20260411-002`, `BUG-20260411-003`, and `BUG-20260411-004`</w:t>
+        <w:t>The main limitation of the current package is no longer execution depth. All `63` designed test cases now have real runtime evidence. The remaining limitation is unresolved defect count: the system still contains four confirmed defects across invoices, purchases, and product import. All four defects are now mirrored into live GitHub Issues, and the invoice-create defect remains the strongest case because it also has server-log proof. Because of this, the report still cannot responsibly claim that the full s</w:t>
+      </w:r>
+      <w:r>
+        <w:rPr>
+          <w:rFonts w:ascii="Courier New" w:hAnsi="Courier New" w:cs="Courier New"/>
+        </w:rPr>
+        <w:t>ystem is stable.</w:t>
+      </w:r>
+    </w:p>
+    <w:p>
+      <w:pPr>
+        <w:pStyle w:val="PlainText"/>
+        <w:rPr>
+          <w:rFonts w:ascii="Courier New" w:hAnsi="Courier New" w:cs="Courier New"/>
+        </w:rPr>
+      </w:pPr>
+    </w:p>
+    <w:p>
+      <w:pPr>
+        <w:pStyle w:val="PlainText"/>
+        <w:rPr>
+          <w:rFonts w:ascii="Courier New" w:hAnsi="Courier New" w:cs="Courier New"/>
+        </w:rPr>
+      </w:pPr>
+      <w:r>
+        <w:rPr>
+          <w:rFonts w:ascii="Courier New" w:hAnsi="Courier New" w:cs="Courier New"/>
+        </w:rPr>
+        <w:t>The package still lacks two completions that would improve its final polish:</w:t>
+      </w:r>
+    </w:p>
+    <w:p>
+      <w:pPr>
+        <w:pStyle w:val="PlainText"/>
+        <w:rPr>
+          <w:rFonts w:ascii="Courier New" w:hAnsi="Courier New" w:cs="Courier New"/>
+        </w:rPr>
+      </w:pPr>
+    </w:p>
+    <w:p>
+      <w:pPr>
+        <w:pStyle w:val="PlainText"/>
+        <w:rPr>
+          <w:rFonts w:ascii="Courier New" w:hAnsi="Courier New" w:cs="Courier New"/>
+        </w:rPr>
+      </w:pPr>
+      <w:r>
+        <w:rPr>
+          <w:rFonts w:ascii="Courier New" w:hAnsi="Courier New" w:cs="Courier New"/>
+        </w:rPr>
+        <w:t>- local screenshot copies for GitHub Issues `#2`, `#3`, and `#4` should be stored under `TestResults/Evidence/Defects/` if they are not already copied into the package</w:t>
       </w:r>
     </w:p>
     <w:p>
@@ -7170,7 +7176,7 @@
         <w:rPr>
           <w:rFonts w:ascii="Courier New" w:hAnsi="Courier New" w:cs="Courier New"/>
         </w:rPr>
-        <w:t>2. open GitHub issues for `BUG-20260411-002`, `BUG-20260411-003`, and `BUG-20260411-004`, then attach the existing screenshots and rerun artifacts</w:t>
+        <w:t>2. attach the saved package screenshots and rerun artifacts to GitHub Issues `#2`, `#3`, and `#4`, then copy the final issue screenshots into `TestResults/Evidence/Defects/`</w:t>
       </w:r>
     </w:p>
     <w:p>
@@ -7242,13 +7248,13 @@
         <w:rPr>
           <w:rFonts w:ascii="Courier New" w:hAnsi="Courier New" w:cs="Courier New"/>
         </w:rPr>
-        <w:t>Based on the current execution evidence, the `Online Sales Management System` now has full case-level execution coverage across the designed UI and API test suite. The package is strong in test design, evidence traceability, and automation support, and it now avoids the earlier weakness of large `Not Run` sections. However, the system still contains four confirmed defects, including a GitHub-tracked invoice-create defect with server-log proof and three additional confirmed UI defects in purchases, invoices,</w:t>
-      </w:r>
-      <w:r>
-        <w:rPr>
-          <w:rFonts w:ascii="Courier New" w:hAnsi="Courier New" w:cs="Courier New"/>
-        </w:rPr>
-        <w:t xml:space="preserve"> and product import. The most defensible conclusion is that the project is execution-complete and submission-ready, but still short of a maximum-confidence quality claim until those confirmed defects are fixed and retested.</w:t>
+        <w:t>Based on the current execution evidence, the `Online Sales Management System` now has full case-level execution coverage across the designed UI and API test suite. The package is strong in test design, evidence traceability, and automation support, and it now avoids the earlier weakness of large `Not Run` sections. However, the system still contains four confirmed defects, all now mirrored into live GitHub Issues, and the invoice-create defect remains the strongest defect because it combines UI proof with s</w:t>
+      </w:r>
+      <w:r>
+        <w:rPr>
+          <w:rFonts w:ascii="Courier New" w:hAnsi="Courier New" w:cs="Courier New"/>
+        </w:rPr>
+        <w:t>erver-log proof. The most defensible conclusion is that the project is execution-complete and submission-ready, but still short of a maximum-confidence quality claim until those confirmed defects are fixed and retested.</w:t>
       </w:r>
     </w:p>
     <w:p>
@@ -7754,7 +7760,21 @@
         <w:rPr>
           <w:rFonts w:ascii="Courier New" w:hAnsi="Courier New" w:cs="Courier New"/>
         </w:rPr>
-        <w:t>- Additional real execution evidence is still required for `Stock`, `Reports`, `Products`, and `Public Catalog`</w:t>
+        <w:t>- Post-fix retest evidence is still required for the four confirmed defects.</w:t>
+      </w:r>
+    </w:p>
+    <w:p>
+      <w:pPr>
+        <w:pStyle w:val="PlainText"/>
+        <w:rPr>
+          <w:rFonts w:ascii="Courier New" w:hAnsi="Courier New" w:cs="Courier New"/>
+        </w:rPr>
+      </w:pPr>
+      <w:r>
+        <w:rPr>
+          <w:rFonts w:ascii="Courier New" w:hAnsi="Courier New" w:cs="Courier New"/>
+        </w:rPr>
+        <w:t>- Optional cross-browser evidence is still not included.</w:t>
       </w:r>
     </w:p>
     <w:p>
@@ -8283,7 +8303,7 @@
     <w:link w:val="PlainTextChar"/>
     <w:uiPriority w:val="99"/>
     <w:unhideWhenUsed/>
-    <w:rsid w:val="00F7796A"/>
+    <w:rsid w:val="001B3BC2"/>
     <w:pPr>
       <w:spacing w:after="0" w:line="240" w:lineRule="auto"/>
     </w:pPr>
@@ -8298,7 +8318,7 @@
     <w:basedOn w:val="DefaultParagraphFont"/>
     <w:link w:val="PlainText"/>
     <w:uiPriority w:val="99"/>
-    <w:rsid w:val="00F7796A"/>
+    <w:rsid w:val="001B3BC2"/>
     <w:rPr>
       <w:rFonts w:ascii="Consolas" w:hAnsi="Consolas"/>
       <w:sz w:val="21"/>

</xml_diff>

<commit_message>
docs: finalize powered by gpt submission package
</commit_message>
<xml_diff>
--- a/Report Test subject/Powered by GPT/MainReport/Powered by GPT - Software Quality Verification - Final Report.docx
+++ b/Report Test subject/Powered by GPT/MainReport/Powered by GPT - Software Quality Verification - Final Report.docx
@@ -7082,20 +7082,6 @@
         <w:rPr>
           <w:rFonts w:ascii="Courier New" w:hAnsi="Courier New" w:cs="Courier New"/>
         </w:rPr>
-        <w:t>- local screenshot copies for GitHub Issues `#2`, `#3`, and `#4` should be stored under `TestResults/Evidence/Defects/` if they are not already copied into the package</w:t>
-      </w:r>
-    </w:p>
-    <w:p>
-      <w:pPr>
-        <w:pStyle w:val="PlainText"/>
-        <w:rPr>
-          <w:rFonts w:ascii="Courier New" w:hAnsi="Courier New" w:cs="Courier New"/>
-        </w:rPr>
-      </w:pPr>
-      <w:r>
-        <w:rPr>
-          <w:rFonts w:ascii="Courier New" w:hAnsi="Courier New" w:cs="Courier New"/>
-        </w:rPr>
         <w:t>- no post-fix retest evidence exists yet for any of the four confirmed defects</w:t>
       </w:r>
     </w:p>
@@ -7106,6 +7092,20 @@
           <w:rFonts w:ascii="Courier New" w:hAnsi="Courier New" w:cs="Courier New"/>
         </w:rPr>
       </w:pPr>
+      <w:r>
+        <w:rPr>
+          <w:rFonts w:ascii="Courier New" w:hAnsi="Courier New" w:cs="Courier New"/>
+        </w:rPr>
+        <w:t>- optional cross-browser evidence is still not included</w:t>
+      </w:r>
+    </w:p>
+    <w:p>
+      <w:pPr>
+        <w:pStyle w:val="PlainText"/>
+        <w:rPr>
+          <w:rFonts w:ascii="Courier New" w:hAnsi="Courier New" w:cs="Courier New"/>
+        </w:rPr>
+      </w:pPr>
     </w:p>
     <w:p>
       <w:pPr>
@@ -7176,21 +7176,21 @@
         <w:rPr>
           <w:rFonts w:ascii="Courier New" w:hAnsi="Courier New" w:cs="Courier New"/>
         </w:rPr>
-        <w:t>2. attach the saved package screenshots and rerun artifacts to GitHub Issues `#2`, `#3`, and `#4`, then copy the final issue screenshots into `TestResults/Evidence/Defects/`</w:t>
-      </w:r>
-    </w:p>
-    <w:p>
-      <w:pPr>
-        <w:pStyle w:val="PlainText"/>
-        <w:rPr>
-          <w:rFonts w:ascii="Courier New" w:hAnsi="Courier New" w:cs="Courier New"/>
-        </w:rPr>
-      </w:pPr>
-      <w:r>
-        <w:rPr>
-          <w:rFonts w:ascii="Courier New" w:hAnsi="Courier New" w:cs="Courier New"/>
-        </w:rPr>
-        <w:t>3. retest invoice cancellation, purchase validation rendering, and import confirm after fixes are available</w:t>
+        <w:t>2. retest invoice cancellation, purchase validation rendering, and import confirm after fixes are available</w:t>
+      </w:r>
+    </w:p>
+    <w:p>
+      <w:pPr>
+        <w:pStyle w:val="PlainText"/>
+        <w:rPr>
+          <w:rFonts w:ascii="Courier New" w:hAnsi="Courier New" w:cs="Courier New"/>
+        </w:rPr>
+      </w:pPr>
+      <w:r>
+        <w:rPr>
+          <w:rFonts w:ascii="Courier New" w:hAnsi="Courier New" w:cs="Courier New"/>
+        </w:rPr>
+        <w:t>3. refresh the defect log, final results workbook, and metrics pack after those retests</w:t>
       </w:r>
     </w:p>
     <w:p>
@@ -8303,7 +8303,7 @@
     <w:link w:val="PlainTextChar"/>
     <w:uiPriority w:val="99"/>
     <w:unhideWhenUsed/>
-    <w:rsid w:val="001B3BC2"/>
+    <w:rsid w:val="009B440A"/>
     <w:pPr>
       <w:spacing w:after="0" w:line="240" w:lineRule="auto"/>
     </w:pPr>
@@ -8318,7 +8318,7 @@
     <w:basedOn w:val="DefaultParagraphFont"/>
     <w:link w:val="PlainText"/>
     <w:uiPriority w:val="99"/>
-    <w:rsid w:val="001B3BC2"/>
+    <w:rsid w:val="009B440A"/>
     <w:rPr>
       <w:rFonts w:ascii="Consolas" w:hAnsi="Consolas"/>
       <w:sz w:val="21"/>

</xml_diff>

<commit_message>
docs: add real defect retest evidence and edge smoke coverage
</commit_message>
<xml_diff>
--- a/Report Test subject/Powered by GPT/MainReport/Powered by GPT - Software Quality Verification - Final Report.docx
+++ b/Report Test subject/Powered by GPT/MainReport/Powered by GPT - Software Quality Verification - Final Report.docx
@@ -7082,21 +7082,21 @@
         <w:rPr>
           <w:rFonts w:ascii="Courier New" w:hAnsi="Courier New" w:cs="Courier New"/>
         </w:rPr>
-        <w:t>- no post-fix retest evidence exists yet for any of the four confirmed defects</w:t>
-      </w:r>
-    </w:p>
-    <w:p>
-      <w:pPr>
-        <w:pStyle w:val="PlainText"/>
-        <w:rPr>
-          <w:rFonts w:ascii="Courier New" w:hAnsi="Courier New" w:cs="Courier New"/>
-        </w:rPr>
-      </w:pPr>
-      <w:r>
-        <w:rPr>
-          <w:rFonts w:ascii="Courier New" w:hAnsi="Courier New" w:cs="Courier New"/>
-        </w:rPr>
-        <w:t>- optional cross-browser evidence is still not included</w:t>
+        <w:t>- focused defect retests were executed again on `2026-04-11`, and all four confirmed defects still reproduced without any status downgrade</w:t>
+      </w:r>
+    </w:p>
+    <w:p>
+      <w:pPr>
+        <w:pStyle w:val="PlainText"/>
+        <w:rPr>
+          <w:rFonts w:ascii="Courier New" w:hAnsi="Courier New" w:cs="Courier New"/>
+        </w:rPr>
+      </w:pPr>
+      <w:r>
+        <w:rPr>
+          <w:rFonts w:ascii="Courier New" w:hAnsi="Courier New" w:cs="Courier New"/>
+        </w:rPr>
+        <w:t>- basic cross-browser evidence now exists through an `Edge` smoke rerun of `TC-UI-AUTH-001`</w:t>
       </w:r>
     </w:p>
     <w:p>
@@ -7176,35 +7176,35 @@
         <w:rPr>
           <w:rFonts w:ascii="Courier New" w:hAnsi="Courier New" w:cs="Courier New"/>
         </w:rPr>
-        <w:t>2. retest invoice cancellation, purchase validation rendering, and import confirm after fixes are available</w:t>
-      </w:r>
-    </w:p>
-    <w:p>
-      <w:pPr>
-        <w:pStyle w:val="PlainText"/>
-        <w:rPr>
-          <w:rFonts w:ascii="Courier New" w:hAnsi="Courier New" w:cs="Courier New"/>
-        </w:rPr>
-      </w:pPr>
-      <w:r>
-        <w:rPr>
-          <w:rFonts w:ascii="Courier New" w:hAnsi="Courier New" w:cs="Courier New"/>
-        </w:rPr>
-        <w:t>3. refresh the defect log, final results workbook, and metrics pack after those retests</w:t>
-      </w:r>
-    </w:p>
-    <w:p>
-      <w:pPr>
-        <w:pStyle w:val="PlainText"/>
-        <w:rPr>
-          <w:rFonts w:ascii="Courier New" w:hAnsi="Courier New" w:cs="Courier New"/>
-        </w:rPr>
-      </w:pPr>
-      <w:r>
-        <w:rPr>
-          <w:rFonts w:ascii="Courier New" w:hAnsi="Courier New" w:cs="Courier New"/>
-        </w:rPr>
-        <w:t>4. optionally add cross-browser evidence if Edge is available</w:t>
+        <w:t>2. fix and retest invoice cancellation, purchase validation rendering, and import confirm after fixes are available</w:t>
+      </w:r>
+    </w:p>
+    <w:p>
+      <w:pPr>
+        <w:pStyle w:val="PlainText"/>
+        <w:rPr>
+          <w:rFonts w:ascii="Courier New" w:hAnsi="Courier New" w:cs="Courier New"/>
+        </w:rPr>
+      </w:pPr>
+      <w:r>
+        <w:rPr>
+          <w:rFonts w:ascii="Courier New" w:hAnsi="Courier New" w:cs="Courier New"/>
+        </w:rPr>
+        <w:t>3. refresh the defect log, final results workbook, and metrics pack after those post-fix retests</w:t>
+      </w:r>
+    </w:p>
+    <w:p>
+      <w:pPr>
+        <w:pStyle w:val="PlainText"/>
+        <w:rPr>
+          <w:rFonts w:ascii="Courier New" w:hAnsi="Courier New" w:cs="Courier New"/>
+        </w:rPr>
+      </w:pPr>
+      <w:r>
+        <w:rPr>
+          <w:rFonts w:ascii="Courier New" w:hAnsi="Courier New" w:cs="Courier New"/>
+        </w:rPr>
+        <w:t>4. expand cross-browser evidence beyond the current `Edge` smoke proof if time permits</w:t>
       </w:r>
     </w:p>
     <w:p>
@@ -7248,13 +7248,13 @@
         <w:rPr>
           <w:rFonts w:ascii="Courier New" w:hAnsi="Courier New" w:cs="Courier New"/>
         </w:rPr>
-        <w:t>Based on the current execution evidence, the `Online Sales Management System` now has full case-level execution coverage across the designed UI and API test suite. The package is strong in test design, evidence traceability, and automation support, and it now avoids the earlier weakness of large `Not Run` sections. However, the system still contains four confirmed defects, all now mirrored into live GitHub Issues, and the invoice-create defect remains the strongest defect because it combines UI proof with s</w:t>
-      </w:r>
-      <w:r>
-        <w:rPr>
-          <w:rFonts w:ascii="Courier New" w:hAnsi="Courier New" w:cs="Courier New"/>
-        </w:rPr>
-        <w:t>erver-log proof. The most defensible conclusion is that the project is execution-complete and submission-ready, but still short of a maximum-confidence quality claim until those confirmed defects are fixed and retested.</w:t>
+        <w:t>Based on the current execution evidence, the `Online Sales Management System` now has full case-level execution coverage across the designed UI and API test suite. The package is strong in test design, evidence traceability, and automation support, and it now avoids the earlier weakness of large `Not Run` sections. The automation evidence is also stronger because a basic `Edge` smoke rerun now confirms `TC-UI-AUTH-001` outside the primary Chrome baseline. However, the system still contains four confirmed de</w:t>
+      </w:r>
+      <w:r>
+        <w:rPr>
+          <w:rFonts w:ascii="Courier New" w:hAnsi="Courier New" w:cs="Courier New"/>
+        </w:rPr>
+        <w:t>fects, all mirrored into live GitHub Issues, and the invoice-create defect remains the strongest defect because it combines UI proof with server-log proof. Focused retests on `2026-04-11` showed that those four defects still reproduce, so the most defensible conclusion is that the project is execution-complete and submission-ready, but still short of a maximum-confidence quality claim until those confirmed defects are fixed and pass post-fix retest.</w:t>
       </w:r>
     </w:p>
     <w:p>
@@ -7760,21 +7760,21 @@
         <w:rPr>
           <w:rFonts w:ascii="Courier New" w:hAnsi="Courier New" w:cs="Courier New"/>
         </w:rPr>
-        <w:t>- Post-fix retest evidence is still required for the four confirmed defects.</w:t>
-      </w:r>
-    </w:p>
-    <w:p>
-      <w:pPr>
-        <w:pStyle w:val="PlainText"/>
-        <w:rPr>
-          <w:rFonts w:ascii="Courier New" w:hAnsi="Courier New" w:cs="Courier New"/>
-        </w:rPr>
-      </w:pPr>
-      <w:r>
-        <w:rPr>
-          <w:rFonts w:ascii="Courier New" w:hAnsi="Courier New" w:cs="Courier New"/>
-        </w:rPr>
-        <w:t>- Optional cross-browser evidence is still not included.</w:t>
+        <w:t>- Focused retests on `2026-04-11` confirmed that all four live defects still reproduce; true post-fix retest evidence is still required.</w:t>
+      </w:r>
+    </w:p>
+    <w:p>
+      <w:pPr>
+        <w:pStyle w:val="PlainText"/>
+        <w:rPr>
+          <w:rFonts w:ascii="Courier New" w:hAnsi="Courier New" w:cs="Courier New"/>
+        </w:rPr>
+      </w:pPr>
+      <w:r>
+        <w:rPr>
+          <w:rFonts w:ascii="Courier New" w:hAnsi="Courier New" w:cs="Courier New"/>
+        </w:rPr>
+        <w:t>- Basic cross-browser evidence is now included through an `Edge` smoke rerun for `TC-UI-AUTH-001`.</w:t>
       </w:r>
     </w:p>
     <w:p>
@@ -8303,7 +8303,7 @@
     <w:link w:val="PlainTextChar"/>
     <w:uiPriority w:val="99"/>
     <w:unhideWhenUsed/>
-    <w:rsid w:val="009B440A"/>
+    <w:rsid w:val="0007227B"/>
     <w:pPr>
       <w:spacing w:after="0" w:line="240" w:lineRule="auto"/>
     </w:pPr>
@@ -8318,7 +8318,7 @@
     <w:basedOn w:val="DefaultParagraphFont"/>
     <w:link w:val="PlainText"/>
     <w:uiPriority w:val="99"/>
-    <w:rsid w:val="009B440A"/>
+    <w:rsid w:val="0007227B"/>
     <w:rPr>
       <w:rFonts w:ascii="Consolas" w:hAnsi="Consolas"/>
       <w:sz w:val="21"/>

</xml_diff>